<commit_message>
Restructure course report narrative
</commit_message>
<xml_diff>
--- a/docs/INTEGRATED_SUBMISSION.docx
+++ b/docs/INTEGRATED_SUBMISSION.docx
@@ -204,7 +204,7 @@
               <w:jc w:val="left"/>
             </w:pPr>
             <w:r>
-              <w:t xml:space="preserve">统一课程报告</w:t>
+              <w:t xml:space="preserve">统一课程完整报告</w:t>
             </w:r>
           </w:p>
         </w:tc>
@@ -852,7 +852,42 @@
         <w:t xml:space="preserve"> </w:t>
       </w:r>
       <w:r>
-        <w:t xml:space="preserve">子目录中，保留其 autotools 构建方式、实验脚本、报告和原始数据。TPC-H Q5/GPU 项目保留在仓库根目录，使用独立的 CMake 构建方式。这样一个 GitHub 仓库即可同时覆盖老师要求的 CPU 端 hashjoin 扩展研究和 GPU 端 TPC-H Q5 实验。</w:t>
+        <w:t xml:space="preserve">子目录中，保留其 autotools 构建方式、实验脚本、报告和原始数据。统一课程完整报告</w:t>
+      </w:r>
+      <w:r>
+        <w:t xml:space="preserve"> </w:t>
+      </w:r>
+      <w:r>
+        <w:rPr>
+          <w:rStyle w:val="VerbatimChar"/>
+        </w:rPr>
+        <w:t xml:space="preserve">hashjoin-cpu/docs/COURSE_REPORT.docx</w:t>
+      </w:r>
+      <w:r>
+        <w:t xml:space="preserve"> </w:t>
+      </w:r>
+      <w:r>
+        <w:t xml:space="preserve">按</w:t>
+      </w:r>
+      <w:r>
+        <w:t xml:space="preserve">“</w:t>
+      </w:r>
+      <w:r>
+        <w:t xml:space="preserve">平常实验 -&gt; 期中 Star Join -&gt; 期末 Full Sweep/VJ/PRVJ</w:t>
+      </w:r>
+      <w:r>
+        <w:t xml:space="preserve">”</w:t>
+      </w:r>
+      <w:r>
+        <w:t xml:space="preserve">的顺序组织，作为老师阅读课程主线的入口。</w:t>
+      </w:r>
+    </w:p>
+    <w:p>
+      <w:pPr>
+        <w:pStyle w:val="BodyText"/>
+      </w:pPr>
+      <w:r>
+        <w:t xml:space="preserve">TPC-H Q5/GPU 项目保留在仓库根目录，使用独立的 CMake 构建方式，作为 GPU 端扩展实验单独报告。这样一个 GitHub 仓库即可同时覆盖老师要求的 CPU 端 hashjoin 扩展研究和 GPU 端 TPC-H Q5 实验。</w:t>
       </w:r>
     </w:p>
     <w:bookmarkEnd w:id="23"/>

</xml_diff>

<commit_message>
Rewrite course report as continuation
</commit_message>
<xml_diff>
--- a/docs/INTEGRATED_SUBMISSION.docx
+++ b/docs/INTEGRATED_SUBMISSION.docx
@@ -867,19 +867,7 @@
         <w:t xml:space="preserve"> </w:t>
       </w:r>
       <w:r>
-        <w:t xml:space="preserve">按</w:t>
-      </w:r>
-      <w:r>
-        <w:t xml:space="preserve">“</w:t>
-      </w:r>
-      <w:r>
-        <w:t xml:space="preserve">平常实验 -&gt; 期中 Star Join -&gt; 期末 Full Sweep/VJ/PRVJ</w:t>
-      </w:r>
-      <w:r>
-        <w:t xml:space="preserve">”</w:t>
-      </w:r>
-      <w:r>
-        <w:t xml:space="preserve">的顺序组织，作为老师阅读课程主线的入口。</w:t>
+        <w:t xml:space="preserve">以前期《内存连接算法报告》的写法为基础，对前期硬件与连接算法实验进行修订，并在后续章节续写期中 Star Join 和期末 VJ/PRVJ 扩展算法实验，作为老师阅读课程主线的入口。</w:t>
       </w:r>
     </w:p>
     <w:p>

</xml_diff>

<commit_message>
Align reports with course phases
</commit_message>
<xml_diff>
--- a/docs/INTEGRATED_SUBMISSION.docx
+++ b/docs/INTEGRATED_SUBMISSION.docx
@@ -231,7 +231,7 @@
               <w:jc w:val="left"/>
             </w:pPr>
             <w:r>
-              <w:t xml:space="preserve">CPU hashjoin 期末报告</w:t>
+              <w:t xml:space="preserve">CPU hashjoin 前期/扩展算法报告</w:t>
             </w:r>
           </w:p>
         </w:tc>
@@ -312,7 +312,7 @@
               <w:jc w:val="left"/>
             </w:pPr>
             <w:r>
-              <w:t xml:space="preserve">TPC-H Q5/GPU 最终报告</w:t>
+              <w:t xml:space="preserve">期末 TPC-H Q5/GPU 报告</w:t>
             </w:r>
           </w:p>
         </w:tc>
@@ -867,7 +867,22 @@
         <w:t xml:space="preserve"> </w:t>
       </w:r>
       <w:r>
-        <w:t xml:space="preserve">以前期《内存连接算法报告》的写法为基础，对前期硬件与连接算法实验进行修订，并在后续章节续写期中 Star Join 和期末 VJ/PRVJ 扩展算法实验，作为老师阅读课程主线的入口。</w:t>
+        <w:t xml:space="preserve">按</w:t>
+      </w:r>
+      <w:r>
+        <w:t xml:space="preserve"> </w:t>
+      </w:r>
+      <w:r>
+        <w:rPr>
+          <w:rStyle w:val="VerbatimChar"/>
+        </w:rPr>
+        <w:t xml:space="preserve">/home/xuzihuan/内存连接算法探索.pdf</w:t>
+      </w:r>
+      <w:r>
+        <w:t xml:space="preserve"> </w:t>
+      </w:r>
+      <w:r>
+        <w:t xml:space="preserve">的阶段要求组织：第 1 到第 5 项作为前期硬件、连接算法、VJ/PRVJ 扩展实验，第 6 项作为期中 Star Join 实验；期末报告则是仓库根目录的 TPC-H Q5/GPU 项目。</w:t>
       </w:r>
     </w:p>
     <w:p>
@@ -875,7 +890,7 @@
         <w:pStyle w:val="BodyText"/>
       </w:pPr>
       <w:r>
-        <w:t xml:space="preserve">TPC-H Q5/GPU 项目保留在仓库根目录，使用独立的 CMake 构建方式，作为 GPU 端扩展实验单独报告。这样一个 GitHub 仓库即可同时覆盖老师要求的 CPU 端 hashjoin 扩展研究和 GPU 端 TPC-H Q5 实验。</w:t>
+        <w:t xml:space="preserve">TPC-H Q5/GPU 项目保留在仓库根目录，使用独立的 CMake 构建方式，作为本课程期末项目单独报告。这样一个 GitHub 仓库即可同时覆盖老师要求的前期 CPU hashjoin 实验、期中 Star Join 实验和期末 TPC-H Q5/GPU 实验。</w:t>
       </w:r>
     </w:p>
     <w:bookmarkEnd w:id="23"/>

</xml_diff>

<commit_message>
Add SF1 full matrix Arrow baseline results
</commit_message>
<xml_diff>
--- a/docs/INTEGRATED_SUBMISSION.docx
+++ b/docs/INTEGRATED_SUBMISSION.docx
@@ -2,12 +2,15 @@
 <file path=word/document.xml><?xml version="1.0" encoding="utf-8"?>
 <w:document xmlns:w="http://schemas.openxmlformats.org/wordprocessingml/2006/main" xmlns:m="http://schemas.openxmlformats.org/officeDocument/2006/math" xmlns:r="http://schemas.openxmlformats.org/officeDocument/2006/relationships" xmlns:o="urn:schemas-microsoft-com:office:office" xmlns:v="urn:schemas-microsoft-com:vml" xmlns:w10="urn:schemas-microsoft-com:office:word" xmlns:a="http://schemas.openxmlformats.org/drawingml/2006/main" xmlns:pic="http://schemas.openxmlformats.org/drawingml/2006/picture" xmlns:wp="http://schemas.openxmlformats.org/drawingml/2006/wordprocessingDrawing">
   <w:body>
-    <w:bookmarkStart w:id="24" w:name="课程大作业整合说明"/>
+    <w:bookmarkStart w:id="13" w:name="课程大作业整合说明"/>
     <w:p>
       <w:pPr>
         <w:pStyle w:val="Heading1"/>
       </w:pPr>
       <w:r>
+        <w:rPr>
+          <w:rFonts w:hint="eastAsia"/>
+        </w:rPr>
         <w:t xml:space="preserve">课程大作业整合说明</w:t>
       </w:r>
     </w:p>
@@ -16,35 +19,60 @@
         <w:pStyle w:val="FirstParagraph"/>
       </w:pPr>
       <w:r>
-        <w:t xml:space="preserve">本仓库将本课程两个交付部分整合到同一个 GitHub 项目中：</w:t>
+        <w:rPr>
+          <w:rFonts w:hint="eastAsia"/>
+        </w:rPr>
+        <w:t xml:space="preserve">本仓库将本课程两个交付部分整合到同一个</w:t>
+      </w:r>
+      <w:r>
+        <w:t xml:space="preserve"> GitHub </w:t>
+      </w:r>
+      <w:r>
+        <w:rPr>
+          <w:rFonts w:hint="eastAsia"/>
+        </w:rPr>
+        <w:t xml:space="preserve">项目中：</w:t>
       </w:r>
     </w:p>
     <w:tbl>
       <w:tblPr>
         <w:tblStyle w:val="Table"/>
-        <w:tblW w:type="pct" w:w="0.0"/>
+        <w:tblW w:type="pct" w:w="5000"/>
+        <w:tblLayout w:type="fixed"/>
         <w:tblLook w:firstRow="1" w:lastRow="0" w:firstColumn="0" w:lastColumn="0" w:noHBand="0" w:noVBand="0" w:val="0020"/>
       </w:tblPr>
-      <w:tblGrid/>
+      <w:tblGrid>
+        <w:gridCol w:w="3960"/>
+        <w:gridCol w:w="3960"/>
+      </w:tblGrid>
       <w:tr>
+        <w:trPr>
+          <w:tblHeader w:val="on"/>
+        </w:trPr>
         <w:tc>
+          <w:tcPr/>
           <w:p>
             <w:pPr>
               <w:pStyle w:val="Compact"/>
-              <w:jc w:val="left"/>
             </w:pPr>
             <w:r>
+              <w:rPr>
+                <w:rFonts w:hint="eastAsia"/>
+              </w:rPr>
               <w:t xml:space="preserve">目录</w:t>
             </w:r>
           </w:p>
         </w:tc>
         <w:tc>
+          <w:tcPr/>
           <w:p>
             <w:pPr>
               <w:pStyle w:val="Compact"/>
-              <w:jc w:val="left"/>
             </w:pPr>
             <w:r>
+              <w:rPr>
+                <w:rFonts w:hint="eastAsia"/>
+              </w:rPr>
               <w:t xml:space="preserve">内容</w:t>
             </w:r>
           </w:p>
@@ -52,10 +80,10 @@
       </w:tr>
       <w:tr>
         <w:tc>
+          <w:tcPr/>
           <w:p>
             <w:pPr>
               <w:pStyle w:val="Compact"/>
-              <w:jc w:val="left"/>
             </w:pPr>
             <w:r>
               <w:rPr>
@@ -66,47 +94,77 @@
           </w:p>
         </w:tc>
         <w:tc>
+          <w:tcPr/>
           <w:p>
             <w:pPr>
               <w:pStyle w:val="Compact"/>
-              <w:jc w:val="left"/>
             </w:pPr>
             <w:r>
-              <w:t xml:space="preserve">基于 ETH Zurich VLDB 2013 hashjoin 开源代码扩展的 CPU 哈希连接框架</w:t>
+              <w:rPr>
+                <w:rFonts w:hint="eastAsia"/>
+              </w:rPr>
+              <w:t xml:space="preserve">基于</w:t>
+            </w:r>
+            <w:r>
+              <w:t xml:space="preserve"> ETH Zurich VLDB 2013 hashjoin </w:t>
+            </w:r>
+            <w:r>
+              <w:rPr>
+                <w:rFonts w:hint="eastAsia"/>
+              </w:rPr>
+              <w:t xml:space="preserve">开源代码扩展的</w:t>
+            </w:r>
+            <w:r>
+              <w:t xml:space="preserve"> CPU </w:t>
+            </w:r>
+            <w:r>
+              <w:rPr>
+                <w:rFonts w:hint="eastAsia"/>
+              </w:rPr>
+              <w:t xml:space="preserve">哈希连接框架</w:t>
             </w:r>
           </w:p>
         </w:tc>
       </w:tr>
       <w:tr>
         <w:tc>
+          <w:tcPr/>
           <w:p>
             <w:pPr>
               <w:pStyle w:val="Compact"/>
-              <w:jc w:val="left"/>
             </w:pPr>
             <w:r>
+              <w:rPr>
+                <w:rFonts w:hint="eastAsia"/>
+              </w:rPr>
               <w:t xml:space="preserve">仓库根目录</w:t>
             </w:r>
           </w:p>
         </w:tc>
         <w:tc>
+          <w:tcPr/>
           <w:p>
             <w:pPr>
               <w:pStyle w:val="Compact"/>
-              <w:jc w:val="left"/>
             </w:pPr>
             <w:r>
-              <w:t xml:space="preserve">TPC-H Q5 CPU/GPU 查询引擎</w:t>
+              <w:t xml:space="preserve">TPC-H Q5 CPU/PyArrow/GPU/cuDF </w:t>
+            </w:r>
+            <w:r>
+              <w:rPr>
+                <w:rFonts w:hint="eastAsia"/>
+              </w:rPr>
+              <w:t xml:space="preserve">查询引擎</w:t>
             </w:r>
           </w:p>
         </w:tc>
       </w:tr>
       <w:tr>
         <w:tc>
+          <w:tcPr/>
           <w:p>
             <w:pPr>
               <w:pStyle w:val="Compact"/>
-              <w:jc w:val="left"/>
             </w:pPr>
             <w:r>
               <w:rPr>
@@ -117,23 +175,29 @@
           </w:p>
         </w:tc>
         <w:tc>
+          <w:tcPr/>
           <w:p>
             <w:pPr>
               <w:pStyle w:val="Compact"/>
-              <w:jc w:val="left"/>
             </w:pPr>
             <w:r>
-              <w:t xml:space="preserve">TPC-H Q5/GPU 项目文档</w:t>
+              <w:t xml:space="preserve">TPC-H Q5/GPU </w:t>
+            </w:r>
+            <w:r>
+              <w:rPr>
+                <w:rFonts w:hint="eastAsia"/>
+              </w:rPr>
+              <w:t xml:space="preserve">项目文档</w:t>
             </w:r>
           </w:p>
         </w:tc>
       </w:tr>
       <w:tr>
         <w:tc>
+          <w:tcPr/>
           <w:p>
             <w:pPr>
               <w:pStyle w:val="Compact"/>
-              <w:jc w:val="left"/>
             </w:pPr>
             <w:r>
               <w:rPr>
@@ -144,53 +208,75 @@
           </w:p>
         </w:tc>
         <w:tc>
+          <w:tcPr/>
           <w:p>
             <w:pPr>
               <w:pStyle w:val="Compact"/>
-              <w:jc w:val="left"/>
             </w:pPr>
             <w:r>
-              <w:t xml:space="preserve">CPU hashjoin 报告、图表和原始实验数据</w:t>
+              <w:t xml:space="preserve">CPU hashjoin </w:t>
+            </w:r>
+            <w:r>
+              <w:rPr>
+                <w:rFonts w:hint="eastAsia"/>
+              </w:rPr>
+              <w:t xml:space="preserve">报告、图表和原始实验数据</w:t>
             </w:r>
           </w:p>
         </w:tc>
       </w:tr>
     </w:tbl>
-    <w:bookmarkStart w:id="20" w:name="主要报告"/>
+    <w:bookmarkStart w:id="9" w:name="主要报告"/>
     <w:p>
       <w:pPr>
         <w:pStyle w:val="Heading2"/>
       </w:pPr>
       <w:r>
+        <w:rPr>
+          <w:rFonts w:hint="eastAsia"/>
+        </w:rPr>
         <w:t xml:space="preserve">主要报告</w:t>
       </w:r>
     </w:p>
     <w:tbl>
       <w:tblPr>
         <w:tblStyle w:val="Table"/>
-        <w:tblW w:type="pct" w:w="0.0"/>
+        <w:tblW w:type="pct" w:w="5000"/>
+        <w:tblLayout w:type="fixed"/>
         <w:tblLook w:firstRow="1" w:lastRow="0" w:firstColumn="0" w:lastColumn="0" w:noHBand="0" w:noVBand="0" w:val="0020"/>
       </w:tblPr>
-      <w:tblGrid/>
+      <w:tblGrid>
+        <w:gridCol w:w="3960"/>
+        <w:gridCol w:w="3960"/>
+      </w:tblGrid>
       <w:tr>
+        <w:trPr>
+          <w:tblHeader w:val="on"/>
+        </w:trPr>
         <w:tc>
+          <w:tcPr/>
           <w:p>
             <w:pPr>
               <w:pStyle w:val="Compact"/>
-              <w:jc w:val="left"/>
             </w:pPr>
             <w:r>
+              <w:rPr>
+                <w:rFonts w:hint="eastAsia"/>
+              </w:rPr>
               <w:t xml:space="preserve">文档</w:t>
             </w:r>
           </w:p>
         </w:tc>
         <w:tc>
+          <w:tcPr/>
           <w:p>
             <w:pPr>
               <w:pStyle w:val="Compact"/>
-              <w:jc w:val="left"/>
             </w:pPr>
             <w:r>
+              <w:rPr>
+                <w:rFonts w:hint="eastAsia"/>
+              </w:rPr>
               <w:t xml:space="preserve">路径</w:t>
             </w:r>
           </w:p>
@@ -198,21 +284,24 @@
       </w:tr>
       <w:tr>
         <w:tc>
+          <w:tcPr/>
           <w:p>
             <w:pPr>
               <w:pStyle w:val="Compact"/>
-              <w:jc w:val="left"/>
             </w:pPr>
             <w:r>
+              <w:rPr>
+                <w:rFonts w:hint="eastAsia"/>
+              </w:rPr>
               <w:t xml:space="preserve">统一课程完整报告</w:t>
             </w:r>
           </w:p>
         </w:tc>
         <w:tc>
+          <w:tcPr/>
           <w:p>
             <w:pPr>
               <w:pStyle w:val="Compact"/>
-              <w:jc w:val="left"/>
             </w:pPr>
             <w:r>
               <w:rPr>
@@ -225,21 +314,27 @@
       </w:tr>
       <w:tr>
         <w:tc>
+          <w:tcPr/>
           <w:p>
             <w:pPr>
               <w:pStyle w:val="Compact"/>
-              <w:jc w:val="left"/>
             </w:pPr>
             <w:r>
-              <w:t xml:space="preserve">CPU hashjoin 前期/扩展算法报告</w:t>
+              <w:t xml:space="preserve">CPU hashjoin </w:t>
+            </w:r>
+            <w:r>
+              <w:rPr>
+                <w:rFonts w:hint="eastAsia"/>
+              </w:rPr>
+              <w:t xml:space="preserve">前期/扩展算法报告</w:t>
             </w:r>
           </w:p>
         </w:tc>
         <w:tc>
+          <w:tcPr/>
           <w:p>
             <w:pPr>
               <w:pStyle w:val="Compact"/>
-              <w:jc w:val="left"/>
             </w:pPr>
             <w:r>
               <w:rPr>
@@ -252,21 +347,27 @@
       </w:tr>
       <w:tr>
         <w:tc>
+          <w:tcPr/>
           <w:p>
             <w:pPr>
               <w:pStyle w:val="Compact"/>
-              <w:jc w:val="left"/>
             </w:pPr>
             <w:r>
-              <w:t xml:space="preserve">Starjoin 期中报告</w:t>
+              <w:t xml:space="preserve">Starjoin </w:t>
+            </w:r>
+            <w:r>
+              <w:rPr>
+                <w:rFonts w:hint="eastAsia"/>
+              </w:rPr>
+              <w:t xml:space="preserve">期中报告</w:t>
             </w:r>
           </w:p>
         </w:tc>
         <w:tc>
+          <w:tcPr/>
           <w:p>
             <w:pPr>
               <w:pStyle w:val="Compact"/>
-              <w:jc w:val="left"/>
             </w:pPr>
             <w:r>
               <w:rPr>
@@ -279,21 +380,27 @@
       </w:tr>
       <w:tr>
         <w:tc>
+          <w:tcPr/>
           <w:p>
             <w:pPr>
               <w:pStyle w:val="Compact"/>
-              <w:jc w:val="left"/>
             </w:pPr>
             <w:r>
-              <w:t xml:space="preserve">CPU hashjoin 交付索引</w:t>
+              <w:t xml:space="preserve">CPU hashjoin </w:t>
+            </w:r>
+            <w:r>
+              <w:rPr>
+                <w:rFonts w:hint="eastAsia"/>
+              </w:rPr>
+              <w:t xml:space="preserve">交付索引</w:t>
             </w:r>
           </w:p>
         </w:tc>
         <w:tc>
+          <w:tcPr/>
           <w:p>
             <w:pPr>
               <w:pStyle w:val="Compact"/>
-              <w:jc w:val="left"/>
             </w:pPr>
             <w:r>
               <w:rPr>
@@ -306,21 +413,33 @@
       </w:tr>
       <w:tr>
         <w:tc>
+          <w:tcPr/>
           <w:p>
             <w:pPr>
               <w:pStyle w:val="Compact"/>
-              <w:jc w:val="left"/>
             </w:pPr>
             <w:r>
-              <w:t xml:space="preserve">期末 TPC-H Q5/GPU 报告</w:t>
+              <w:rPr>
+                <w:rFonts w:hint="eastAsia"/>
+              </w:rPr>
+              <w:t xml:space="preserve">期末</w:t>
+            </w:r>
+            <w:r>
+              <w:t xml:space="preserve"> TPC-H Q5/GPU </w:t>
+            </w:r>
+            <w:r>
+              <w:rPr>
+                <w:rFonts w:hint="eastAsia"/>
+              </w:rPr>
+              <w:t xml:space="preserve">报告</w:t>
             </w:r>
           </w:p>
         </w:tc>
         <w:tc>
+          <w:tcPr/>
           <w:p>
             <w:pPr>
               <w:pStyle w:val="Compact"/>
-              <w:jc w:val="left"/>
             </w:pPr>
             <w:r>
               <w:rPr>
@@ -332,14 +451,20 @@
         </w:tc>
       </w:tr>
     </w:tbl>
-    <w:bookmarkEnd w:id="20"/>
-    <w:bookmarkStart w:id="21" w:name="cpu-hashjoin-复现方式"/>
+    <w:bookmarkEnd w:id="9"/>
+    <w:bookmarkStart w:id="10" w:name="cpu-hashjoin-复现方式"/>
     <w:p>
       <w:pPr>
         <w:pStyle w:val="Heading2"/>
       </w:pPr>
       <w:r>
-        <w:t xml:space="preserve">CPU Hashjoin 复现方式</w:t>
+        <w:t xml:space="preserve">CPU Hashjoin </w:t>
+      </w:r>
+      <w:r>
+        <w:rPr>
+          <w:rFonts w:hint="eastAsia"/>
+        </w:rPr>
+        <w:t xml:space="preserve">复现方式</w:t>
       </w:r>
     </w:p>
     <w:p>
@@ -373,16 +498,19 @@
         <w:pStyle w:val="FirstParagraph"/>
       </w:pPr>
       <w:r>
+        <w:rPr>
+          <w:rFonts w:hint="eastAsia"/>
+        </w:rPr>
         <w:t xml:space="preserve">主要实验脚本：</w:t>
       </w:r>
     </w:p>
     <w:p>
       <w:pPr>
+        <w:pStyle w:val="Compact"/>
         <w:numPr>
           <w:ilvl w:val="0"/>
           <w:numId w:val="1001"/>
         </w:numPr>
-        <w:pStyle w:val="Compact"/>
       </w:pPr>
       <w:r>
         <w:rPr>
@@ -393,11 +521,11 @@
     </w:p>
     <w:p>
       <w:pPr>
+        <w:pStyle w:val="Compact"/>
         <w:numPr>
           <w:ilvl w:val="0"/>
           <w:numId w:val="1001"/>
         </w:numPr>
-        <w:pStyle w:val="Compact"/>
       </w:pPr>
       <w:r>
         <w:rPr>
@@ -408,11 +536,11 @@
     </w:p>
     <w:p>
       <w:pPr>
+        <w:pStyle w:val="Compact"/>
         <w:numPr>
           <w:ilvl w:val="0"/>
           <w:numId w:val="1001"/>
         </w:numPr>
-        <w:pStyle w:val="Compact"/>
       </w:pPr>
       <w:r>
         <w:rPr>
@@ -426,16 +554,28 @@
         <w:pStyle w:val="FirstParagraph"/>
       </w:pPr>
       <w:r>
-        <w:t xml:space="preserve">最终 CPU hashjoin 数据和图表：</w:t>
+        <w:rPr>
+          <w:rFonts w:hint="eastAsia"/>
+        </w:rPr>
+        <w:t xml:space="preserve">最终</w:t>
+      </w:r>
+      <w:r>
+        <w:t xml:space="preserve"> CPU hashjoin </w:t>
+      </w:r>
+      <w:r>
+        <w:rPr>
+          <w:rFonts w:hint="eastAsia"/>
+        </w:rPr>
+        <w:t xml:space="preserve">数据和图表：</w:t>
       </w:r>
     </w:p>
     <w:p>
       <w:pPr>
+        <w:pStyle w:val="Compact"/>
         <w:numPr>
           <w:ilvl w:val="0"/>
           <w:numId w:val="1002"/>
         </w:numPr>
-        <w:pStyle w:val="Compact"/>
       </w:pPr>
       <w:r>
         <w:rPr>
@@ -446,11 +586,11 @@
     </w:p>
     <w:p>
       <w:pPr>
+        <w:pStyle w:val="Compact"/>
         <w:numPr>
           <w:ilvl w:val="0"/>
           <w:numId w:val="1002"/>
         </w:numPr>
-        <w:pStyle w:val="Compact"/>
       </w:pPr>
       <w:r>
         <w:rPr>
@@ -459,14 +599,20 @@
         <w:t xml:space="preserve">hashjoin-cpu/docs/assets/</w:t>
       </w:r>
     </w:p>
-    <w:bookmarkEnd w:id="21"/>
-    <w:bookmarkStart w:id="22" w:name="tpc-h-q5gpu-复现方式"/>
+    <w:bookmarkEnd w:id="10"/>
+    <w:bookmarkStart w:id="11" w:name="tpc-h-q5gpu-复现方式"/>
     <w:p>
       <w:pPr>
         <w:pStyle w:val="Heading2"/>
       </w:pPr>
       <w:r>
-        <w:t xml:space="preserve">TPC-H Q5/GPU 复现方式</w:t>
+        <w:t xml:space="preserve">TPC-H Q5/GPU </w:t>
+      </w:r>
+      <w:r>
+        <w:rPr>
+          <w:rFonts w:hint="eastAsia"/>
+        </w:rPr>
+        <w:t xml:space="preserve">复现方式</w:t>
       </w:r>
     </w:p>
     <w:p>
@@ -474,7 +620,13 @@
         <w:pStyle w:val="FirstParagraph"/>
       </w:pPr>
       <w:r>
-        <w:t xml:space="preserve">CPU 构建与测试：</w:t>
+        <w:t xml:space="preserve">CPU </w:t>
+      </w:r>
+      <w:r>
+        <w:rPr>
+          <w:rFonts w:hint="eastAsia"/>
+        </w:rPr>
+        <w:t xml:space="preserve">构建与测试：</w:t>
       </w:r>
     </w:p>
     <w:p>
@@ -634,7 +786,13 @@
         <w:pStyle w:val="FirstParagraph"/>
       </w:pPr>
       <w:r>
-        <w:t xml:space="preserve">CUDA 构建需要带</w:t>
+        <w:t xml:space="preserve">CUDA </w:t>
+      </w:r>
+      <w:r>
+        <w:rPr>
+          <w:rFonts w:hint="eastAsia"/>
+        </w:rPr>
+        <w:t xml:space="preserve">构建需要带</w:t>
       </w:r>
       <w:r>
         <w:t xml:space="preserve"> </w:t>
@@ -649,7 +807,19 @@
         <w:t xml:space="preserve"> </w:t>
       </w:r>
       <w:r>
-        <w:t xml:space="preserve">和 NVIDIA 驱动的服务器：</w:t>
+        <w:rPr>
+          <w:rFonts w:hint="eastAsia"/>
+        </w:rPr>
+        <w:t xml:space="preserve">和</w:t>
+      </w:r>
+      <w:r>
+        <w:t xml:space="preserve"> NVIDIA </w:t>
+      </w:r>
+      <w:r>
+        <w:rPr>
+          <w:rFonts w:hint="eastAsia"/>
+        </w:rPr>
+        <w:t xml:space="preserve">驱动的服务器：</w:t>
       </w:r>
     </w:p>
     <w:p>
@@ -822,13 +992,16 @@
         <w:t xml:space="preserve">--output-on-failure</w:t>
       </w:r>
     </w:p>
-    <w:bookmarkEnd w:id="22"/>
-    <w:bookmarkStart w:id="23" w:name="说明"/>
+    <w:bookmarkEnd w:id="11"/>
+    <w:bookmarkStart w:id="12" w:name="说明"/>
     <w:p>
       <w:pPr>
         <w:pStyle w:val="Heading2"/>
       </w:pPr>
       <w:r>
+        <w:rPr>
+          <w:rFonts w:hint="eastAsia"/>
+        </w:rPr>
         <w:t xml:space="preserve">说明</w:t>
       </w:r>
     </w:p>
@@ -837,7 +1010,13 @@
         <w:pStyle w:val="FirstParagraph"/>
       </w:pPr>
       <w:r>
-        <w:t xml:space="preserve">CPU hashjoin 框架放在</w:t>
+        <w:t xml:space="preserve">CPU hashjoin </w:t>
+      </w:r>
+      <w:r>
+        <w:rPr>
+          <w:rFonts w:hint="eastAsia"/>
+        </w:rPr>
+        <w:t xml:space="preserve">框架放在</w:t>
       </w:r>
       <w:r>
         <w:t xml:space="preserve"> </w:t>
@@ -852,7 +1031,19 @@
         <w:t xml:space="preserve"> </w:t>
       </w:r>
       <w:r>
-        <w:t xml:space="preserve">子目录中，保留其 autotools 构建方式、实验脚本、报告和原始数据。统一课程完整报告</w:t>
+        <w:rPr>
+          <w:rFonts w:hint="eastAsia"/>
+        </w:rPr>
+        <w:t xml:space="preserve">子目录中，保留其</w:t>
+      </w:r>
+      <w:r>
+        <w:t xml:space="preserve"> autotools </w:t>
+      </w:r>
+      <w:r>
+        <w:rPr>
+          <w:rFonts w:hint="eastAsia"/>
+        </w:rPr>
+        <w:t xml:space="preserve">构建方式、实验脚本、报告和原始数据。统一课程完整报告</w:t>
       </w:r>
       <w:r>
         <w:t xml:space="preserve"> </w:t>
@@ -867,22 +1058,73 @@
         <w:t xml:space="preserve"> </w:t>
       </w:r>
       <w:r>
-        <w:t xml:space="preserve">按</w:t>
+        <w:rPr>
+          <w:rFonts w:hint="eastAsia"/>
+        </w:rPr>
+        <w:t xml:space="preserve">按课程</w:t>
       </w:r>
       <w:r>
         <w:t xml:space="preserve"> </w:t>
       </w:r>
       <w:r>
         <w:rPr>
-          <w:rStyle w:val="VerbatimChar"/>
-        </w:rPr>
-        <w:t xml:space="preserve">/home/xuzihuan/内存连接算法探索.pdf</w:t>
+          <w:rFonts w:hint="eastAsia"/>
+        </w:rPr>
+        <w:t xml:space="preserve">PDF《内存连接算法探索》的阶段要求组织：第</w:t>
+      </w:r>
+      <w:r>
+        <w:t xml:space="preserve"> 1 </w:t>
+      </w:r>
+      <w:r>
+        <w:rPr>
+          <w:rFonts w:hint="eastAsia"/>
+        </w:rPr>
+        <w:t xml:space="preserve">到第</w:t>
+      </w:r>
+      <w:r>
+        <w:t xml:space="preserve"> 5 </w:t>
+      </w:r>
+      <w:r>
+        <w:rPr>
+          <w:rFonts w:hint="eastAsia"/>
+        </w:rPr>
+        <w:t xml:space="preserve">项作为前期硬件、连接算法、VJ/PRVJ</w:t>
       </w:r>
       <w:r>
         <w:t xml:space="preserve"> </w:t>
       </w:r>
       <w:r>
-        <w:t xml:space="preserve">的阶段要求组织：第 1 到第 5 项作为前期硬件、连接算法、VJ/PRVJ 扩展实验，第 6 项作为期中 Star Join 实验；期末报告则是仓库根目录的 TPC-H Q5/GPU 项目。</w:t>
+        <w:rPr>
+          <w:rFonts w:hint="eastAsia"/>
+        </w:rPr>
+        <w:t xml:space="preserve">扩展实验，第</w:t>
+      </w:r>
+      <w:r>
+        <w:t xml:space="preserve"> 6 </w:t>
+      </w:r>
+      <w:r>
+        <w:rPr>
+          <w:rFonts w:hint="eastAsia"/>
+        </w:rPr>
+        <w:t xml:space="preserve">项作为期中</w:t>
+      </w:r>
+      <w:r>
+        <w:t xml:space="preserve"> Star Join </w:t>
+      </w:r>
+      <w:r>
+        <w:rPr>
+          <w:rFonts w:hint="eastAsia"/>
+        </w:rPr>
+        <w:t xml:space="preserve">实验；期末报告则是仓库根目录的</w:t>
+      </w:r>
+      <w:r>
+        <w:t xml:space="preserve"> TPC-H Q5/GPU </w:t>
+      </w:r>
+      <w:r>
+        <w:rPr>
+          <w:rFonts w:hint="eastAsia"/>
+        </w:rPr>
+        <w:t xml:space="preserve">项目。</w:t>
       </w:r>
     </w:p>
     <w:p>
@@ -890,12 +1132,103 @@
         <w:pStyle w:val="BodyText"/>
       </w:pPr>
       <w:r>
-        <w:t xml:space="preserve">TPC-H Q5/GPU 项目保留在仓库根目录，使用独立的 CMake 构建方式，作为本课程期末项目单独报告。这样一个 GitHub 仓库即可同时覆盖老师要求的前期 CPU hashjoin 实验、期中 Star Join 实验和期末 TPC-H Q5/GPU 实验。</w:t>
+        <w:t xml:space="preserve">TPC-H Q5/GPU </w:t>
+      </w:r>
+      <w:r>
+        <w:rPr>
+          <w:rFonts w:hint="eastAsia"/>
+        </w:rPr>
+        <w:t xml:space="preserve">项目保留在仓库根目录，使用独立的</w:t>
+      </w:r>
+      <w:r>
+        <w:t xml:space="preserve"> CMake </w:t>
+      </w:r>
+      <w:r>
+        <w:rPr>
+          <w:rFonts w:hint="eastAsia"/>
+        </w:rPr>
+        <w:t xml:space="preserve">构建方式，作为本课程期末项目单独报告。官方</w:t>
+      </w:r>
+      <w:r>
+        <w:t xml:space="preserve"> TPC-H SF1 </w:t>
+      </w:r>
+      <w:r>
+        <w:rPr>
+          <w:rFonts w:hint="eastAsia"/>
+        </w:rPr>
+        <w:t xml:space="preserve">已补跑</w:t>
+      </w:r>
+      <w:r>
+        <w:t xml:space="preserve"> CPU/PyArrow/GPU/cuDF full </w:t>
+      </w:r>
+      <w:r>
+        <w:rPr>
+          <w:rFonts w:hint="eastAsia"/>
+        </w:rPr>
+        <w:t xml:space="preserve">matrix，所有成功</w:t>
+      </w:r>
+      <w:r>
+        <w:t xml:space="preserve"> engine </w:t>
+      </w:r>
+      <w:r>
+        <w:rPr>
+          <w:rFonts w:hint="eastAsia"/>
+        </w:rPr>
+        <w:t xml:space="preserve">的</w:t>
+      </w:r>
+      <w:r>
+        <w:t xml:space="preserve"> result hash </w:t>
+      </w:r>
+      <w:r>
+        <w:rPr>
+          <w:rFonts w:hint="eastAsia"/>
+        </w:rPr>
+        <w:t xml:space="preserve">一致。这样一个</w:t>
+      </w:r>
+      <w:r>
+        <w:t xml:space="preserve"> GitHub </w:t>
+      </w:r>
+      <w:r>
+        <w:rPr>
+          <w:rFonts w:hint="eastAsia"/>
+        </w:rPr>
+        <w:t xml:space="preserve">仓库即可同时覆盖老师要求的前期</w:t>
+      </w:r>
+      <w:r>
+        <w:t xml:space="preserve"> CPU hashjoin </w:t>
+      </w:r>
+      <w:r>
+        <w:rPr>
+          <w:rFonts w:hint="eastAsia"/>
+        </w:rPr>
+        <w:t xml:space="preserve">实验、期中</w:t>
+      </w:r>
+      <w:r>
+        <w:t xml:space="preserve"> Star Join </w:t>
+      </w:r>
+      <w:r>
+        <w:rPr>
+          <w:rFonts w:hint="eastAsia"/>
+        </w:rPr>
+        <w:t xml:space="preserve">实验和期末</w:t>
+      </w:r>
+      <w:r>
+        <w:t xml:space="preserve"> TPC-H Q5/GPU </w:t>
+      </w:r>
+      <w:r>
+        <w:rPr>
+          <w:rFonts w:hint="eastAsia"/>
+        </w:rPr>
+        <w:t xml:space="preserve">实验。</w:t>
       </w:r>
     </w:p>
-    <w:bookmarkEnd w:id="23"/>
-    <w:bookmarkEnd w:id="24"/>
-    <w:sectPr/>
+    <w:bookmarkEnd w:id="12"/>
+    <w:bookmarkEnd w:id="13"/>
+    <w:sectPr>
+      <w:footnotePr>
+        <w:numRestart w:val="eachSect"/>
+      </w:footnotePr>
+    </w:sectPr>
   </w:body>
 </w:document>
 </file>
@@ -926,14 +1259,14 @@
 <file path=word/numbering.xml><?xml version="1.0" encoding="utf-8"?>
 <w:numbering xmlns:w="http://schemas.openxmlformats.org/wordprocessingml/2006/main">
   <w:abstractNum w:abstractNumId="990">
-    <w:nsid w:val="2c1ae401"/>
+    <w:nsid w:val="0000A990"/>
     <w:multiLevelType w:val="multilevel"/>
     <w:lvl w:ilvl="0">
       <w:numFmt w:val="bullet"/>
       <w:lvlText w:val=" "/>
       <w:lvlJc w:val="left"/>
       <w:pPr>
-        <w:ind w:left="720" w:hanging="480"/>
+        <w:ind w:left="720" w:hanging="360"/>
       </w:pPr>
     </w:lvl>
     <w:lvl w:ilvl="1">
@@ -941,7 +1274,7 @@
       <w:lvlText w:val=" "/>
       <w:lvlJc w:val="left"/>
       <w:pPr>
-        <w:ind w:left="1440" w:hanging="480"/>
+        <w:ind w:left="1440" w:hanging="360"/>
       </w:pPr>
     </w:lvl>
     <w:lvl w:ilvl="2">
@@ -949,7 +1282,7 @@
       <w:lvlText w:val=" "/>
       <w:lvlJc w:val="left"/>
       <w:pPr>
-        <w:ind w:left="2160" w:hanging="480"/>
+        <w:ind w:left="2160" w:hanging="360"/>
       </w:pPr>
     </w:lvl>
     <w:lvl w:ilvl="3">
@@ -957,7 +1290,7 @@
       <w:lvlText w:val=" "/>
       <w:lvlJc w:val="left"/>
       <w:pPr>
-        <w:ind w:left="2880" w:hanging="480"/>
+        <w:ind w:left="2880" w:hanging="360"/>
       </w:pPr>
     </w:lvl>
     <w:lvl w:ilvl="4">
@@ -965,7 +1298,7 @@
       <w:lvlText w:val=" "/>
       <w:lvlJc w:val="left"/>
       <w:pPr>
-        <w:ind w:left="3600" w:hanging="480"/>
+        <w:ind w:left="3600" w:hanging="360"/>
       </w:pPr>
     </w:lvl>
     <w:lvl w:ilvl="5">
@@ -973,7 +1306,7 @@
       <w:lvlText w:val=" "/>
       <w:lvlJc w:val="left"/>
       <w:pPr>
-        <w:ind w:left="4320" w:hanging="480"/>
+        <w:ind w:left="4320" w:hanging="360"/>
       </w:pPr>
     </w:lvl>
     <w:lvl w:ilvl="6">
@@ -981,7 +1314,7 @@
       <w:lvlText w:val=" "/>
       <w:lvlJc w:val="left"/>
       <w:pPr>
-        <w:ind w:left="5040" w:hanging="480"/>
+        <w:ind w:left="5040" w:hanging="360"/>
       </w:pPr>
     </w:lvl>
     <w:lvl w:ilvl="7">
@@ -989,7 +1322,7 @@
       <w:lvlText w:val=" "/>
       <w:lvlJc w:val="left"/>
       <w:pPr>
-        <w:ind w:left="5760" w:hanging="480"/>
+        <w:ind w:left="5760" w:hanging="360"/>
       </w:pPr>
     </w:lvl>
     <w:lvl w:ilvl="8">
@@ -997,84 +1330,111 @@
       <w:lvlText w:val=" "/>
       <w:lvlJc w:val="left"/>
       <w:pPr>
-        <w:ind w:left="6480" w:hanging="480"/>
+        <w:ind w:left="6480" w:hanging="360"/>
       </w:pPr>
     </w:lvl>
   </w:abstractNum>
   <w:abstractNum w:abstractNumId="991">
-    <w:nsid w:val="ea454b4c"/>
+    <w:nsid w:val="0000A991"/>
     <w:multiLevelType w:val="multilevel"/>
     <w:lvl w:ilvl="0">
       <w:numFmt w:val="bullet"/>
-      <w:lvlText w:val="•"/>
+      <w:lvlText w:val=""/>
       <w:lvlJc w:val="left"/>
       <w:pPr>
-        <w:ind w:left="720" w:hanging="480"/>
-      </w:pPr>
+        <w:ind w:left="720" w:hanging="360"/>
+      </w:pPr>
+      <w:rPr>
+        <w:rFonts w:ascii="Symbol" w:hAnsi="Symbol" w:cs="Symbol" w:hint="default"/>
+      </w:rPr>
     </w:lvl>
     <w:lvl w:ilvl="1">
       <w:numFmt w:val="bullet"/>
-      <w:lvlText w:val="–"/>
+      <w:lvlText w:val="o"/>
       <w:lvlJc w:val="left"/>
       <w:pPr>
-        <w:ind w:left="1440" w:hanging="480"/>
-      </w:pPr>
+        <w:ind w:left="1440" w:hanging="360"/>
+      </w:pPr>
+      <w:rPr>
+        <w:rFonts w:ascii="Courier New" w:hAnsi="Courier New" w:cs="Courier New" w:hint="default"/>
+      </w:rPr>
     </w:lvl>
     <w:lvl w:ilvl="2">
       <w:numFmt w:val="bullet"/>
-      <w:lvlText w:val="•"/>
+      <w:lvlText w:val=""/>
       <w:lvlJc w:val="left"/>
       <w:pPr>
-        <w:ind w:left="2160" w:hanging="480"/>
-      </w:pPr>
+        <w:ind w:left="2160" w:hanging="360"/>
+      </w:pPr>
+      <w:rPr>
+        <w:rFonts w:ascii="Wingdings" w:hAnsi="Wingdings" w:cs="Wingdings" w:hint="default"/>
+      </w:rPr>
     </w:lvl>
     <w:lvl w:ilvl="3">
       <w:numFmt w:val="bullet"/>
-      <w:lvlText w:val="–"/>
+      <w:lvlText w:val=""/>
       <w:lvlJc w:val="left"/>
       <w:pPr>
-        <w:ind w:left="2880" w:hanging="480"/>
-      </w:pPr>
+        <w:ind w:left="2880" w:hanging="360"/>
+      </w:pPr>
+      <w:rPr>
+        <w:rFonts w:ascii="Symbol" w:hAnsi="Symbol" w:cs="Symbol" w:hint="default"/>
+      </w:rPr>
     </w:lvl>
     <w:lvl w:ilvl="4">
       <w:numFmt w:val="bullet"/>
-      <w:lvlText w:val="•"/>
+      <w:lvlText w:val="o"/>
       <w:lvlJc w:val="left"/>
       <w:pPr>
-        <w:ind w:left="3600" w:hanging="480"/>
-      </w:pPr>
+        <w:ind w:left="3600" w:hanging="360"/>
+      </w:pPr>
+      <w:rPr>
+        <w:rFonts w:ascii="Courier New" w:hAnsi="Courier New" w:cs="Courier New" w:hint="default"/>
+      </w:rPr>
     </w:lvl>
     <w:lvl w:ilvl="5">
       <w:numFmt w:val="bullet"/>
-      <w:lvlText w:val="–"/>
+      <w:lvlText w:val=""/>
       <w:lvlJc w:val="left"/>
       <w:pPr>
-        <w:ind w:left="4320" w:hanging="480"/>
-      </w:pPr>
+        <w:ind w:left="4320" w:hanging="360"/>
+      </w:pPr>
+      <w:rPr>
+        <w:rFonts w:ascii="Wingdings" w:hAnsi="Wingdings" w:cs="Wingdings" w:hint="default"/>
+      </w:rPr>
     </w:lvl>
     <w:lvl w:ilvl="6">
       <w:numFmt w:val="bullet"/>
-      <w:lvlText w:val="•"/>
+      <w:lvlText w:val=""/>
       <w:lvlJc w:val="left"/>
       <w:pPr>
-        <w:ind w:left="5040" w:hanging="480"/>
-      </w:pPr>
+        <w:ind w:left="5040" w:hanging="360"/>
+      </w:pPr>
+      <w:rPr>
+        <w:rFonts w:ascii="Symbol" w:hAnsi="Symbol" w:cs="Symbol" w:hint="default"/>
+      </w:rPr>
     </w:lvl>
     <w:lvl w:ilvl="7">
       <w:numFmt w:val="bullet"/>
-      <w:lvlText w:val="–"/>
+      <w:lvlText w:val="o"/>
       <w:lvlJc w:val="left"/>
       <w:pPr>
-        <w:ind w:left="5760" w:hanging="480"/>
-      </w:pPr>
+        <w:ind w:left="5760" w:hanging="360"/>
+      </w:pPr>
+      <w:rPr>
+        <w:rFonts w:ascii="Courier New" w:hAnsi="Courier New" w:cs="Courier New" w:hint="default"/>
+      </w:rPr>
     </w:lvl>
     <w:lvl w:ilvl="8">
       <w:numFmt w:val="bullet"/>
-      <w:lvlText w:val="•"/>
+      <w:lvlText w:val=""/>
       <w:lvlJc w:val="left"/>
       <w:pPr>
-        <w:ind w:left="6480" w:hanging="480"/>
-      </w:pPr>
+        <w:ind w:left="6480" w:hanging="360"/>
+      </w:pPr>
+      <w:rPr>
+        <w:rFonts w:ascii="Wingdings" w:hAnsi="Wingdings" w:cs="Wingdings" w:hint="default"/>
+      </w:rPr>
     </w:lvl>
   </w:abstractNum>
   <w:num w:numId="1000">
@@ -1094,10 +1454,10 @@
   <w:docDefaults>
     <w:rPrDefault>
       <w:rPr>
-        <w:rFonts w:asciiTheme="minorHAnsi" w:cstheme="minorBidi" w:eastAsiaTheme="minorHAnsi" w:hAnsiTheme="minorHAnsi"/>
+        <w:rFonts w:asciiTheme="minorHAnsi" w:cstheme="minorBidi" w:eastAsiaTheme="minorEastAsia" w:hAnsiTheme="minorHAnsi"/>
         <w:sz w:val="24"/>
         <w:szCs w:val="24"/>
-        <w:lang w:bidi="ar-SA" w:eastAsia="en-US" w:val="en-US"/>
+        <w:lang w:bidi="ar-SA" w:eastAsia="zh-CN" w:val="en-US"/>
       </w:rPr>
     </w:rPrDefault>
     <w:pPrDefault>
@@ -1115,10 +1475,10 @@
     <w:name w:val="Body Text"/>
     <w:basedOn w:val="Normal"/>
     <w:link w:val="BodyTextChar"/>
+    <w:qFormat/>
     <w:pPr>
       <w:spacing w:after="180" w:before="180"/>
     </w:pPr>
-    <w:qFormat/>
   </w:style>
   <w:style w:customStyle="1" w:styleId="FirstParagraph" w:type="paragraph">
     <w:name w:val="First Paragraph"/>
@@ -1138,57 +1498,111 @@
     <w:name w:val="Title"/>
     <w:basedOn w:val="Normal"/>
     <w:next w:val="BodyText"/>
+    <w:link w:val="TitleChar"/>
+    <w:uiPriority w:val="10"/>
     <w:qFormat/>
+    <w:rsid w:val="00A10FD9"/>
     <w:pPr>
-      <w:keepNext/>
-      <w:keepLines/>
-      <w:spacing w:after="240" w:before="480"/>
+      <w:spacing w:after="80" w:line="240" w:lineRule="auto"/>
+      <w:contextualSpacing/>
       <w:jc w:val="center"/>
     </w:pPr>
     <w:rPr>
       <w:rFonts w:asciiTheme="majorHAnsi" w:cstheme="majorBidi" w:eastAsiaTheme="majorEastAsia" w:hAnsiTheme="majorHAnsi"/>
-      <w:b/>
-      <w:bCs/>
-      <w:color w:themeColor="accent1" w:themeShade="B5" w:val="345A8A"/>
-      <w:sz w:val="36"/>
-      <w:szCs w:val="36"/>
+      <w:sz w:val="56"/>
+      <w:szCs w:val="56"/>
+    </w:rPr>
+  </w:style>
+  <w:style w:customStyle="1" w:styleId="TitleChar" w:type="character">
+    <w:name w:val="Title Char"/>
+    <w:basedOn w:val="DefaultParagraphFont"/>
+    <w:link w:val="Title"/>
+    <w:uiPriority w:val="10"/>
+    <w:rsid w:val="00A10FD9"/>
+    <w:rPr>
+      <w:rFonts w:asciiTheme="majorHAnsi" w:cstheme="majorBidi" w:eastAsiaTheme="majorEastAsia" w:hAnsiTheme="majorHAnsi"/>
+      <w:sz w:val="56"/>
+      <w:szCs w:val="56"/>
     </w:rPr>
   </w:style>
   <w:style w:styleId="Subtitle" w:type="paragraph">
     <w:name w:val="Subtitle"/>
+    <w:basedOn w:val="Title"/>
+    <w:next w:val="BodyText"/>
+    <w:link w:val="SubtitleChar"/>
+    <w:uiPriority w:val="11"/>
+    <w:qFormat/>
+    <w:rsid w:val="00A10FD9"/>
+    <w:pPr>
+      <w:numPr>
+        <w:ilvl w:val="1"/>
+      </w:numPr>
+    </w:pPr>
+    <w:rPr>
+      <w:rFonts w:cstheme="majorBidi" w:eastAsiaTheme="majorEastAsia"/>
+      <w:spacing w:val="15"/>
+      <w:sz w:val="28"/>
+      <w:szCs w:val="28"/>
+    </w:rPr>
+  </w:style>
+  <w:style w:customStyle="1" w:styleId="SubtitleChar" w:type="character">
+    <w:name w:val="Subtitle Char"/>
+    <w:basedOn w:val="DefaultParagraphFont"/>
+    <w:link w:val="Subtitle"/>
+    <w:uiPriority w:val="11"/>
+    <w:rsid w:val="00A10FD9"/>
+    <w:rPr>
+      <w:rFonts w:cstheme="majorBidi" w:eastAsiaTheme="majorEastAsia"/>
+      <w:color w:themeColor="text1" w:themeTint="A6" w:val="595959"/>
+      <w:spacing w:val="15"/>
+      <w:sz w:val="28"/>
+      <w:szCs w:val="28"/>
+    </w:rPr>
+  </w:style>
+  <w:style w:customStyle="1" w:styleId="Author" w:type="paragraph">
+    <w:name w:val="Author"/>
     <w:basedOn w:val="Title"/>
     <w:next w:val="BodyText"/>
     <w:qFormat/>
     <w:pPr>
       <w:keepNext/>
       <w:keepLines/>
-      <w:spacing w:after="240" w:before="240"/>
-      <w:jc w:val="center"/>
     </w:pPr>
     <w:rPr>
-      <w:sz w:val="30"/>
-      <w:szCs w:val="30"/>
-    </w:rPr>
-  </w:style>
-  <w:style w:customStyle="1" w:styleId="Author" w:type="paragraph">
-    <w:name w:val="Author"/>
+      <w:sz w:val="24"/>
+      <w:szCs w:val="24"/>
+    </w:rPr>
+  </w:style>
+  <w:style w:styleId="Date" w:type="paragraph">
+    <w:name w:val="Date"/>
+    <w:basedOn w:val="Title"/>
     <w:next w:val="BodyText"/>
     <w:qFormat/>
     <w:pPr>
       <w:keepNext/>
       <w:keepLines/>
-      <w:jc w:val="center"/>
     </w:pPr>
-  </w:style>
-  <w:style w:styleId="Date" w:type="paragraph">
-    <w:name w:val="Date"/>
-    <w:next w:val="BodyText"/>
+    <w:rPr>
+      <w:sz w:val="24"/>
+      <w:szCs w:val="24"/>
+    </w:rPr>
+  </w:style>
+  <w:style w:customStyle="1" w:styleId="AbstractTitle" w:type="paragraph">
+    <w:name w:val="Abstract Title"/>
+    <w:basedOn w:val="Normal"/>
+    <w:next w:val="Abstract"/>
     <w:qFormat/>
     <w:pPr>
       <w:keepNext/>
       <w:keepLines/>
+      <w:spacing w:after="0" w:before="300"/>
       <w:jc w:val="center"/>
     </w:pPr>
+    <w:rPr>
+      <w:b/>
+      <w:sz w:val="20"/>
+      <w:szCs w:val="20"/>
+    </w:rPr>
   </w:style>
   <w:style w:customStyle="1" w:styleId="Abstract" w:type="paragraph">
     <w:name w:val="Abstract"/>
@@ -1198,7 +1612,7 @@
     <w:pPr>
       <w:keepNext/>
       <w:keepLines/>
-      <w:spacing w:after="300" w:before="300"/>
+      <w:spacing w:after="300" w:before="100"/>
     </w:pPr>
     <w:rPr>
       <w:sz w:val="20"/>
@@ -1214,191 +1628,321 @@
     <w:rPr/>
   </w:style>
   <w:style w:styleId="Heading1" w:type="paragraph">
-    <w:name w:val="Heading 1"/>
+    <w:name w:val="heading 1"/>
     <w:basedOn w:val="Normal"/>
     <w:next w:val="BodyText"/>
+    <w:link w:val="Heading1Char"/>
     <w:uiPriority w:val="9"/>
     <w:qFormat/>
+    <w:rsid w:val="00A10FD9"/>
     <w:pPr>
       <w:keepNext/>
       <w:keepLines/>
-      <w:spacing w:after="0" w:before="480"/>
+      <w:spacing w:after="80" w:before="360"/>
       <w:outlineLvl w:val="0"/>
     </w:pPr>
     <w:rPr>
       <w:rFonts w:asciiTheme="majorHAnsi" w:cstheme="majorBidi" w:eastAsiaTheme="majorEastAsia" w:hAnsiTheme="majorHAnsi"/>
-      <w:b/>
-      <w:bCs/>
-      <w:color w:themeColor="accent1" w:val="4F81BD"/>
-      <w:sz w:val="32"/>
-      <w:szCs w:val="32"/>
+      <w:color w:themeColor="accent1" w:themeShade="BF" w:val="0F4761"/>
+      <w:sz w:val="40"/>
+      <w:szCs w:val="40"/>
     </w:rPr>
   </w:style>
   <w:style w:styleId="Heading2" w:type="paragraph">
-    <w:name w:val="Heading 2"/>
+    <w:name w:val="heading 2"/>
     <w:basedOn w:val="Normal"/>
     <w:next w:val="BodyText"/>
+    <w:link w:val="Heading2Char"/>
     <w:uiPriority w:val="9"/>
+    <w:semiHidden/>
     <w:unhideWhenUsed/>
     <w:qFormat/>
+    <w:rsid w:val="00A10FD9"/>
     <w:pPr>
       <w:keepNext/>
       <w:keepLines/>
-      <w:spacing w:after="0" w:before="200"/>
+      <w:spacing w:after="80" w:before="160"/>
       <w:outlineLvl w:val="1"/>
     </w:pPr>
     <w:rPr>
       <w:rFonts w:asciiTheme="majorHAnsi" w:cstheme="majorBidi" w:eastAsiaTheme="majorEastAsia" w:hAnsiTheme="majorHAnsi"/>
-      <w:b/>
-      <w:bCs/>
-      <w:color w:themeColor="accent1" w:val="4F81BD"/>
-      <w:sz w:val="28"/>
-      <w:szCs w:val="28"/>
+      <w:color w:themeColor="accent1" w:themeShade="BF" w:val="0F4761"/>
+      <w:sz w:val="32"/>
+      <w:szCs w:val="32"/>
     </w:rPr>
   </w:style>
   <w:style w:styleId="Heading3" w:type="paragraph">
-    <w:name w:val="Heading 3"/>
+    <w:name w:val="heading 3"/>
     <w:basedOn w:val="Normal"/>
     <w:next w:val="BodyText"/>
+    <w:link w:val="Heading3Char"/>
     <w:uiPriority w:val="9"/>
+    <w:semiHidden/>
     <w:unhideWhenUsed/>
     <w:qFormat/>
+    <w:rsid w:val="00A10FD9"/>
     <w:pPr>
       <w:keepNext/>
       <w:keepLines/>
-      <w:spacing w:after="0" w:before="200"/>
+      <w:spacing w:after="80" w:before="160"/>
       <w:outlineLvl w:val="2"/>
     </w:pPr>
     <w:rPr>
-      <w:rFonts w:asciiTheme="majorHAnsi" w:cstheme="majorBidi" w:eastAsiaTheme="majorEastAsia" w:hAnsiTheme="majorHAnsi"/>
-      <w:b/>
-      <w:bCs/>
-      <w:color w:themeColor="accent1" w:val="4F81BD"/>
-      <w:sz w:val="24"/>
-      <w:szCs w:val="24"/>
+      <w:rFonts w:cstheme="majorBidi" w:eastAsiaTheme="majorEastAsia"/>
+      <w:color w:themeColor="accent1" w:themeShade="BF" w:val="0F4761"/>
+      <w:sz w:val="28"/>
+      <w:szCs w:val="28"/>
     </w:rPr>
   </w:style>
   <w:style w:styleId="Heading4" w:type="paragraph">
-    <w:name w:val="Heading 4"/>
+    <w:name w:val="heading 4"/>
     <w:basedOn w:val="Normal"/>
     <w:next w:val="BodyText"/>
+    <w:link w:val="Heading4Char"/>
     <w:uiPriority w:val="9"/>
+    <w:semiHidden/>
     <w:unhideWhenUsed/>
     <w:qFormat/>
+    <w:rsid w:val="00A10FD9"/>
     <w:pPr>
       <w:keepNext/>
       <w:keepLines/>
-      <w:spacing w:after="0" w:before="200"/>
+      <w:spacing w:after="40" w:before="80"/>
       <w:outlineLvl w:val="3"/>
     </w:pPr>
     <w:rPr>
-      <w:rFonts w:asciiTheme="majorHAnsi" w:cstheme="majorBidi" w:eastAsiaTheme="majorEastAsia" w:hAnsiTheme="majorHAnsi"/>
+      <w:rFonts w:cstheme="majorBidi" w:eastAsiaTheme="majorEastAsia"/>
       <w:i/>
-      <w:bCs/>
-      <w:color w:themeColor="accent1" w:val="4F81BD"/>
-      <w:sz w:val="24"/>
-      <w:szCs w:val="24"/>
+      <w:iCs/>
+      <w:color w:themeColor="accent1" w:themeShade="BF" w:val="0F4761"/>
     </w:rPr>
   </w:style>
   <w:style w:styleId="Heading5" w:type="paragraph">
-    <w:name w:val="Heading 5"/>
+    <w:name w:val="heading 5"/>
     <w:basedOn w:val="Normal"/>
     <w:next w:val="BodyText"/>
+    <w:link w:val="Heading5Char"/>
     <w:uiPriority w:val="9"/>
+    <w:semiHidden/>
     <w:unhideWhenUsed/>
     <w:qFormat/>
+    <w:rsid w:val="00A10FD9"/>
     <w:pPr>
       <w:keepNext/>
       <w:keepLines/>
-      <w:spacing w:after="0" w:before="200"/>
+      <w:spacing w:after="40" w:before="80"/>
       <w:outlineLvl w:val="4"/>
     </w:pPr>
     <w:rPr>
-      <w:rFonts w:asciiTheme="majorHAnsi" w:cstheme="majorBidi" w:eastAsiaTheme="majorEastAsia" w:hAnsiTheme="majorHAnsi"/>
-      <w:iCs/>
-      <w:color w:themeColor="accent1" w:val="4F81BD"/>
-      <w:sz w:val="24"/>
-      <w:szCs w:val="24"/>
+      <w:rFonts w:cstheme="majorBidi" w:eastAsiaTheme="majorEastAsia"/>
+      <w:color w:themeColor="accent1" w:themeShade="BF" w:val="0F4761"/>
     </w:rPr>
   </w:style>
   <w:style w:styleId="Heading6" w:type="paragraph">
-    <w:name w:val="Heading 6"/>
+    <w:name w:val="heading 6"/>
     <w:basedOn w:val="Normal"/>
     <w:next w:val="BodyText"/>
+    <w:link w:val="Heading6Char"/>
     <w:uiPriority w:val="9"/>
+    <w:semiHidden/>
     <w:unhideWhenUsed/>
     <w:qFormat/>
+    <w:rsid w:val="00A10FD9"/>
     <w:pPr>
       <w:keepNext/>
       <w:keepLines/>
-      <w:spacing w:after="0" w:before="200"/>
+      <w:spacing w:after="0" w:before="40"/>
       <w:outlineLvl w:val="5"/>
     </w:pPr>
     <w:rPr>
-      <w:rFonts w:asciiTheme="majorHAnsi" w:cstheme="majorBidi" w:eastAsiaTheme="majorEastAsia" w:hAnsiTheme="majorHAnsi"/>
-      <w:color w:themeColor="accent1" w:val="4F81BD"/>
-      <w:sz w:val="24"/>
-      <w:szCs w:val="24"/>
+      <w:rFonts w:cstheme="majorBidi" w:eastAsiaTheme="majorEastAsia"/>
+      <w:i/>
+      <w:iCs/>
+      <w:color w:themeColor="text1" w:themeTint="A6" w:val="595959"/>
     </w:rPr>
   </w:style>
   <w:style w:styleId="Heading7" w:type="paragraph">
-    <w:name w:val="Heading 7"/>
+    <w:name w:val="heading 7"/>
     <w:basedOn w:val="Normal"/>
     <w:next w:val="BodyText"/>
+    <w:link w:val="Heading7Char"/>
     <w:uiPriority w:val="9"/>
+    <w:semiHidden/>
     <w:unhideWhenUsed/>
     <w:qFormat/>
+    <w:rsid w:val="00A10FD9"/>
     <w:pPr>
       <w:keepNext/>
       <w:keepLines/>
-      <w:spacing w:after="0" w:before="200"/>
+      <w:spacing w:after="0" w:before="40"/>
       <w:outlineLvl w:val="6"/>
     </w:pPr>
     <w:rPr>
-      <w:rFonts w:asciiTheme="majorHAnsi" w:cstheme="majorBidi" w:eastAsiaTheme="majorEastAsia" w:hAnsiTheme="majorHAnsi"/>
-      <w:color w:themeColor="accent1" w:val="4F81BD"/>
-      <w:sz w:val="24"/>
-      <w:szCs w:val="24"/>
+      <w:rFonts w:cstheme="majorBidi" w:eastAsiaTheme="majorEastAsia"/>
+      <w:color w:themeColor="text1" w:themeTint="A6" w:val="595959"/>
     </w:rPr>
   </w:style>
   <w:style w:styleId="Heading8" w:type="paragraph">
-    <w:name w:val="Heading 8"/>
+    <w:name w:val="heading 8"/>
     <w:basedOn w:val="Normal"/>
     <w:next w:val="BodyText"/>
+    <w:link w:val="Heading8Char"/>
     <w:uiPriority w:val="9"/>
+    <w:semiHidden/>
     <w:unhideWhenUsed/>
     <w:qFormat/>
+    <w:rsid w:val="00A10FD9"/>
     <w:pPr>
       <w:keepNext/>
       <w:keepLines/>
-      <w:spacing w:after="0" w:before="200"/>
+      <w:spacing w:after="0"/>
       <w:outlineLvl w:val="7"/>
     </w:pPr>
     <w:rPr>
-      <w:rFonts w:asciiTheme="majorHAnsi" w:cstheme="majorBidi" w:eastAsiaTheme="majorEastAsia" w:hAnsiTheme="majorHAnsi"/>
-      <w:color w:themeColor="accent1" w:val="4F81BD"/>
-      <w:sz w:val="24"/>
-      <w:szCs w:val="24"/>
+      <w:rFonts w:cstheme="majorBidi" w:eastAsiaTheme="majorEastAsia"/>
+      <w:i/>
+      <w:iCs/>
+      <w:color w:themeColor="text1" w:themeTint="D8" w:val="272727"/>
     </w:rPr>
   </w:style>
   <w:style w:styleId="Heading9" w:type="paragraph">
-    <w:name w:val="Heading 9"/>
+    <w:name w:val="heading 9"/>
     <w:basedOn w:val="Normal"/>
     <w:next w:val="BodyText"/>
+    <w:link w:val="Heading9Char"/>
     <w:uiPriority w:val="9"/>
+    <w:semiHidden/>
     <w:unhideWhenUsed/>
     <w:qFormat/>
+    <w:rsid w:val="00A10FD9"/>
     <w:pPr>
       <w:keepNext/>
       <w:keepLines/>
-      <w:spacing w:after="0" w:before="200"/>
+      <w:spacing w:after="0"/>
       <w:outlineLvl w:val="8"/>
     </w:pPr>
     <w:rPr>
+      <w:rFonts w:cstheme="majorBidi" w:eastAsiaTheme="majorEastAsia"/>
+      <w:color w:themeColor="text1" w:themeTint="D8" w:val="272727"/>
+    </w:rPr>
+  </w:style>
+  <w:style w:customStyle="1" w:styleId="Heading1Char" w:type="character">
+    <w:name w:val="Heading 1 Char"/>
+    <w:basedOn w:val="DefaultParagraphFont"/>
+    <w:link w:val="Heading1"/>
+    <w:uiPriority w:val="9"/>
+    <w:rsid w:val="00A10FD9"/>
+    <w:rPr>
       <w:rFonts w:asciiTheme="majorHAnsi" w:cstheme="majorBidi" w:eastAsiaTheme="majorEastAsia" w:hAnsiTheme="majorHAnsi"/>
-      <w:color w:themeColor="accent1" w:val="4F81BD"/>
-      <w:sz w:val="24"/>
-      <w:szCs w:val="24"/>
+      <w:color w:themeColor="accent1" w:themeShade="BF" w:val="0F4761"/>
+      <w:sz w:val="40"/>
+      <w:szCs w:val="40"/>
+    </w:rPr>
+  </w:style>
+  <w:style w:customStyle="1" w:styleId="Heading2Char" w:type="character">
+    <w:name w:val="Heading 2 Char"/>
+    <w:basedOn w:val="DefaultParagraphFont"/>
+    <w:link w:val="Heading2"/>
+    <w:uiPriority w:val="9"/>
+    <w:semiHidden/>
+    <w:rsid w:val="00A10FD9"/>
+    <w:rPr>
+      <w:rFonts w:asciiTheme="majorHAnsi" w:cstheme="majorBidi" w:eastAsiaTheme="majorEastAsia" w:hAnsiTheme="majorHAnsi"/>
+      <w:color w:themeColor="accent1" w:themeShade="BF" w:val="0F4761"/>
+      <w:sz w:val="32"/>
+      <w:szCs w:val="32"/>
+    </w:rPr>
+  </w:style>
+  <w:style w:customStyle="1" w:styleId="Heading3Char" w:type="character">
+    <w:name w:val="Heading 3 Char"/>
+    <w:basedOn w:val="DefaultParagraphFont"/>
+    <w:link w:val="Heading3"/>
+    <w:uiPriority w:val="9"/>
+    <w:semiHidden/>
+    <w:rsid w:val="00A10FD9"/>
+    <w:rPr>
+      <w:rFonts w:cstheme="majorBidi" w:eastAsiaTheme="majorEastAsia"/>
+      <w:color w:themeColor="accent1" w:themeShade="BF" w:val="0F4761"/>
+      <w:sz w:val="28"/>
+      <w:szCs w:val="28"/>
+    </w:rPr>
+  </w:style>
+  <w:style w:customStyle="1" w:styleId="Heading4Char" w:type="character">
+    <w:name w:val="Heading 4 Char"/>
+    <w:basedOn w:val="DefaultParagraphFont"/>
+    <w:link w:val="Heading4"/>
+    <w:uiPriority w:val="9"/>
+    <w:semiHidden/>
+    <w:rsid w:val="00A10FD9"/>
+    <w:rPr>
+      <w:rFonts w:cstheme="majorBidi" w:eastAsiaTheme="majorEastAsia"/>
+      <w:i/>
+      <w:iCs/>
+      <w:color w:themeColor="accent1" w:themeShade="BF" w:val="0F4761"/>
+    </w:rPr>
+  </w:style>
+  <w:style w:customStyle="1" w:styleId="Heading5Char" w:type="character">
+    <w:name w:val="Heading 5 Char"/>
+    <w:basedOn w:val="DefaultParagraphFont"/>
+    <w:link w:val="Heading5"/>
+    <w:uiPriority w:val="9"/>
+    <w:semiHidden/>
+    <w:rsid w:val="00A10FD9"/>
+    <w:rPr>
+      <w:rFonts w:cstheme="majorBidi" w:eastAsiaTheme="majorEastAsia"/>
+      <w:color w:themeColor="accent1" w:themeShade="BF" w:val="0F4761"/>
+    </w:rPr>
+  </w:style>
+  <w:style w:customStyle="1" w:styleId="Heading6Char" w:type="character">
+    <w:name w:val="Heading 6 Char"/>
+    <w:basedOn w:val="DefaultParagraphFont"/>
+    <w:link w:val="Heading6"/>
+    <w:uiPriority w:val="9"/>
+    <w:semiHidden/>
+    <w:rsid w:val="00A10FD9"/>
+    <w:rPr>
+      <w:rFonts w:cstheme="majorBidi" w:eastAsiaTheme="majorEastAsia"/>
+      <w:i/>
+      <w:iCs/>
+      <w:color w:themeColor="text1" w:themeTint="A6" w:val="595959"/>
+    </w:rPr>
+  </w:style>
+  <w:style w:customStyle="1" w:styleId="Heading7Char" w:type="character">
+    <w:name w:val="Heading 7 Char"/>
+    <w:basedOn w:val="DefaultParagraphFont"/>
+    <w:link w:val="Heading7"/>
+    <w:uiPriority w:val="9"/>
+    <w:semiHidden/>
+    <w:rsid w:val="00A10FD9"/>
+    <w:rPr>
+      <w:rFonts w:cstheme="majorBidi" w:eastAsiaTheme="majorEastAsia"/>
+      <w:color w:themeColor="text1" w:themeTint="A6" w:val="595959"/>
+    </w:rPr>
+  </w:style>
+  <w:style w:customStyle="1" w:styleId="Heading8Char" w:type="character">
+    <w:name w:val="Heading 8 Char"/>
+    <w:basedOn w:val="DefaultParagraphFont"/>
+    <w:link w:val="Heading8"/>
+    <w:uiPriority w:val="9"/>
+    <w:semiHidden/>
+    <w:rsid w:val="00A10FD9"/>
+    <w:rPr>
+      <w:rFonts w:cstheme="majorBidi" w:eastAsiaTheme="majorEastAsia"/>
+      <w:i/>
+      <w:iCs/>
+      <w:color w:themeColor="text1" w:themeTint="D8" w:val="272727"/>
+    </w:rPr>
+  </w:style>
+  <w:style w:customStyle="1" w:styleId="Heading9Char" w:type="character">
+    <w:name w:val="Heading 9 Char"/>
+    <w:basedOn w:val="DefaultParagraphFont"/>
+    <w:link w:val="Heading9"/>
+    <w:uiPriority w:val="9"/>
+    <w:semiHidden/>
+    <w:rsid w:val="00A10FD9"/>
+    <w:rPr>
+      <w:rFonts w:cstheme="majorBidi" w:eastAsiaTheme="majorEastAsia"/>
+      <w:color w:themeColor="text1" w:themeTint="D8" w:val="272727"/>
     </w:rPr>
   </w:style>
   <w:style w:styleId="BlockText" w:type="paragraph">
@@ -1420,6 +1964,18 @@
     <w:uiPriority w:val="9"/>
     <w:unhideWhenUsed/>
     <w:qFormat/>
+  </w:style>
+  <w:style w:styleId="FootnoteBlockText" w:type="paragraph">
+    <w:name w:val="Footnote Block Text"/>
+    <w:basedOn w:val="FootnoteText"/>
+    <w:next w:val="FootnoteText"/>
+    <w:uiPriority w:val="9"/>
+    <w:unhideWhenUsed/>
+    <w:qFormat/>
+    <w:pPr>
+      <w:spacing w:after="100" w:before="100"/>
+      <w:ind w:firstLine="0" w:left="480" w:right="480"/>
+    </w:pPr>
   </w:style>
   <w:style w:default="1" w:styleId="DefaultParagraphFont" w:type="character">
     <w:name w:val="Default Paragraph Font"/>
@@ -1442,18 +1998,11 @@
       </w:tblCellMar>
     </w:tblPr>
     <w:tblStylePr w:type="firstRow">
-      <w:tblPr>
-        <w:jc w:val="left"/>
-        <w:tblInd w:type="dxa" w:w="0"/>
-      </w:tblPr>
-      <w:trPr>
-        <w:jc w:val="left"/>
-      </w:trPr>
       <w:tcPr>
-        <w:vAlign w:val="bottom"/>
         <w:tcBorders>
           <w:bottom w:val="single"/>
         </w:tcBorders>
+        <w:vAlign w:val="bottom"/>
       </w:tcPr>
     </w:tblStylePr>
   </w:style>
@@ -1568,8 +2117,8 @@
     <w:name w:val="KeywordTok"/>
     <w:basedOn w:val="VerbatimChar"/>
     <w:rPr>
+      <w:b/>
       <w:color w:val="007020"/>
-      <w:b/>
     </w:rPr>
   </w:style>
   <w:style w:type="character" w:customStyle="1" w:styleId="DataTypeTok">
@@ -1645,40 +2194,43 @@
   <w:style w:type="character" w:customStyle="1" w:styleId="ImportTok">
     <w:name w:val="ImportTok"/>
     <w:basedOn w:val="VerbatimChar"/>
-    <w:rPr/>
+    <w:rPr>
+      <w:b/>
+      <w:color w:val="008000"/>
+    </w:rPr>
   </w:style>
   <w:style w:type="character" w:customStyle="1" w:styleId="CommentTok">
     <w:name w:val="CommentTok"/>
     <w:basedOn w:val="VerbatimChar"/>
     <w:rPr>
+      <w:i/>
       <w:color w:val="60a0b0"/>
-      <w:i/>
     </w:rPr>
   </w:style>
   <w:style w:type="character" w:customStyle="1" w:styleId="DocumentationTok">
     <w:name w:val="DocumentationTok"/>
     <w:basedOn w:val="VerbatimChar"/>
     <w:rPr>
+      <w:i/>
       <w:color w:val="ba2121"/>
-      <w:i/>
     </w:rPr>
   </w:style>
   <w:style w:type="character" w:customStyle="1" w:styleId="AnnotationTok">
     <w:name w:val="AnnotationTok"/>
     <w:basedOn w:val="VerbatimChar"/>
     <w:rPr>
-      <w:color w:val="60a0b0"/>
       <w:b/>
       <w:i/>
+      <w:color w:val="60a0b0"/>
     </w:rPr>
   </w:style>
   <w:style w:type="character" w:customStyle="1" w:styleId="CommentVarTok">
     <w:name w:val="CommentVarTok"/>
     <w:basedOn w:val="VerbatimChar"/>
     <w:rPr>
-      <w:color w:val="60a0b0"/>
       <w:b/>
       <w:i/>
+      <w:color w:val="60a0b0"/>
     </w:rPr>
   </w:style>
   <w:style w:type="character" w:customStyle="1" w:styleId="OtherTok">
@@ -1706,8 +2258,8 @@
     <w:name w:val="ControlFlowTok"/>
     <w:basedOn w:val="VerbatimChar"/>
     <w:rPr>
+      <w:b/>
       <w:color w:val="007020"/>
-      <w:b/>
     </w:rPr>
   </w:style>
   <w:style w:type="character" w:customStyle="1" w:styleId="OperatorTok">
@@ -1720,7 +2272,9 @@
   <w:style w:type="character" w:customStyle="1" w:styleId="BuiltInTok">
     <w:name w:val="BuiltInTok"/>
     <w:basedOn w:val="VerbatimChar"/>
-    <w:rPr/>
+    <w:rPr>
+      <w:color w:val="008000"/>
+    </w:rPr>
   </w:style>
   <w:style w:type="character" w:customStyle="1" w:styleId="ExtensionTok">
     <w:name w:val="ExtensionTok"/>
@@ -1750,34 +2304,34 @@
     <w:name w:val="InformationTok"/>
     <w:basedOn w:val="VerbatimChar"/>
     <w:rPr>
-      <w:color w:val="60a0b0"/>
       <w:b/>
       <w:i/>
+      <w:color w:val="60a0b0"/>
     </w:rPr>
   </w:style>
   <w:style w:type="character" w:customStyle="1" w:styleId="WarningTok">
     <w:name w:val="WarningTok"/>
     <w:basedOn w:val="VerbatimChar"/>
     <w:rPr>
-      <w:color w:val="60a0b0"/>
       <w:b/>
       <w:i/>
+      <w:color w:val="60a0b0"/>
     </w:rPr>
   </w:style>
   <w:style w:type="character" w:customStyle="1" w:styleId="AlertTok">
     <w:name w:val="AlertTok"/>
     <w:basedOn w:val="VerbatimChar"/>
     <w:rPr>
+      <w:b/>
       <w:color w:val="ff0000"/>
-      <w:b/>
     </w:rPr>
   </w:style>
   <w:style w:type="character" w:customStyle="1" w:styleId="ErrorTok">
     <w:name w:val="ErrorTok"/>
     <w:basedOn w:val="VerbatimChar"/>
     <w:rPr>
+      <w:b/>
       <w:color w:val="ff0000"/>
-      <w:b/>
     </w:rPr>
   </w:style>
   <w:style w:type="character" w:customStyle="1" w:styleId="NormalTok">
@@ -1799,44 +2353,44 @@
         <a:sysClr val="window" lastClr="FFFFFF"/>
       </a:lt1>
       <a:dk2>
-        <a:srgbClr val="1F497D"/>
+        <a:srgbClr val="0E2841"/>
       </a:dk2>
       <a:lt2>
-        <a:srgbClr val="EEECE1"/>
+        <a:srgbClr val="E8E8E8"/>
       </a:lt2>
       <a:accent1>
-        <a:srgbClr val="4F81BD"/>
+        <a:srgbClr val="156082"/>
       </a:accent1>
       <a:accent2>
-        <a:srgbClr val="C0504D"/>
+        <a:srgbClr val="E97132"/>
       </a:accent2>
       <a:accent3>
-        <a:srgbClr val="9BBB59"/>
+        <a:srgbClr val="196B24"/>
       </a:accent3>
       <a:accent4>
-        <a:srgbClr val="8064A2"/>
+        <a:srgbClr val="0F9ED5"/>
       </a:accent4>
       <a:accent5>
-        <a:srgbClr val="4BACC6"/>
+        <a:srgbClr val="A02B93"/>
       </a:accent5>
       <a:accent6>
-        <a:srgbClr val="F79646"/>
+        <a:srgbClr val="4EA72E"/>
       </a:accent6>
       <a:hlink>
-        <a:srgbClr val="0000FF"/>
+        <a:srgbClr val="467886"/>
       </a:hlink>
       <a:folHlink>
-        <a:srgbClr val="800080"/>
+        <a:srgbClr val="96607D"/>
       </a:folHlink>
     </a:clrScheme>
     <a:fontScheme name="Office">
       <a:majorFont>
-        <a:latin typeface="Calibri"/>
+        <a:latin typeface="Aptos Display" panose="02110004020202020204"/>
         <a:ea typeface=""/>
         <a:cs typeface=""/>
-        <a:font script="Jpan" typeface="ＭＳ ゴシック"/>
+        <a:font script="Jpan" typeface="游ゴシック Light"/>
         <a:font script="Hang" typeface="맑은 고딕"/>
-        <a:font script="Hans" typeface="宋体"/>
+        <a:font script="Hans" typeface="等线 Light"/>
         <a:font script="Hant" typeface="新細明體"/>
         <a:font script="Arab" typeface="Times New Roman"/>
         <a:font script="Hebr" typeface="Times New Roman"/>
@@ -1863,14 +2417,32 @@
         <a:font script="Mong" typeface="Mongolian Baiti"/>
         <a:font script="Viet" typeface="Times New Roman"/>
         <a:font script="Uigh" typeface="Microsoft Uighur"/>
+        <a:font script="Geor" typeface="Sylfaen"/>
+        <a:font script="Armn" typeface="Arial"/>
+        <a:font script="Bugi" typeface="Leelawadee UI"/>
+        <a:font script="Bopo" typeface="Microsoft JhengHei"/>
+        <a:font script="Java" typeface="Javanese Text"/>
+        <a:font script="Lisu" typeface="Segoe UI"/>
+        <a:font script="Mymr" typeface="Myanmar Text"/>
+        <a:font script="Nkoo" typeface="Ebrima"/>
+        <a:font script="Olck" typeface="Nirmala UI"/>
+        <a:font script="Osma" typeface="Ebrima"/>
+        <a:font script="Phag" typeface="Phagspa"/>
+        <a:font script="Syrn" typeface="Estrangelo Edessa"/>
+        <a:font script="Syrj" typeface="Estrangelo Edessa"/>
+        <a:font script="Syre" typeface="Estrangelo Edessa"/>
+        <a:font script="Sora" typeface="Nirmala UI"/>
+        <a:font script="Tale" typeface="Microsoft Tai Le"/>
+        <a:font script="Talu" typeface="Microsoft New Tai Lue"/>
+        <a:font script="Tfng" typeface="Ebrima"/>
       </a:majorFont>
       <a:minorFont>
-        <a:latin typeface="Cambria"/>
+        <a:latin typeface="Aptos" panose="02110004020202020204"/>
         <a:ea typeface=""/>
         <a:cs typeface=""/>
-        <a:font script="Jpan" typeface="ＭＳ 明朝"/>
+        <a:font script="Jpan" typeface="游明朝"/>
         <a:font script="Hang" typeface="맑은 고딕"/>
-        <a:font script="Hans" typeface="宋体"/>
+        <a:font script="Hans" typeface="等线"/>
         <a:font script="Hant" typeface="新細明體"/>
         <a:font script="Arab" typeface="Arial"/>
         <a:font script="Hebr" typeface="Arial"/>
@@ -1897,6 +2469,24 @@
         <a:font script="Mong" typeface="Mongolian Baiti"/>
         <a:font script="Viet" typeface="Arial"/>
         <a:font script="Uigh" typeface="Microsoft Uighur"/>
+        <a:font script="Geor" typeface="Sylfaen"/>
+        <a:font script="Armn" typeface="Arial"/>
+        <a:font script="Bugi" typeface="Leelawadee UI"/>
+        <a:font script="Bopo" typeface="Microsoft JhengHei"/>
+        <a:font script="Java" typeface="Javanese Text"/>
+        <a:font script="Lisu" typeface="Segoe UI"/>
+        <a:font script="Mymr" typeface="Myanmar Text"/>
+        <a:font script="Nkoo" typeface="Ebrima"/>
+        <a:font script="Olck" typeface="Nirmala UI"/>
+        <a:font script="Osma" typeface="Ebrima"/>
+        <a:font script="Phag" typeface="Phagspa"/>
+        <a:font script="Syrn" typeface="Estrangelo Edessa"/>
+        <a:font script="Syrj" typeface="Estrangelo Edessa"/>
+        <a:font script="Syre" typeface="Estrangelo Edessa"/>
+        <a:font script="Sora" typeface="Nirmala UI"/>
+        <a:font script="Tale" typeface="Microsoft Tai Le"/>
+        <a:font script="Talu" typeface="Microsoft New Tai Lue"/>
+        <a:font script="Tfng" typeface="Ebrima"/>
       </a:minorFont>
     </a:fontScheme>
     <a:fmtScheme name="Office">
@@ -1908,200 +2498,141 @@
           <a:gsLst>
             <a:gs pos="0">
               <a:schemeClr val="phClr">
-                <a:tint val="50000"/>
-                <a:satMod val="300000"/>
+                <a:lumMod val="110000"/>
+                <a:satMod val="105000"/>
+                <a:tint val="67000"/>
               </a:schemeClr>
             </a:gs>
-            <a:gs pos="35000">
+            <a:gs pos="50000">
               <a:schemeClr val="phClr">
-                <a:tint val="37000"/>
-                <a:satMod val="300000"/>
+                <a:lumMod val="105000"/>
+                <a:satMod val="103000"/>
+                <a:tint val="73000"/>
               </a:schemeClr>
             </a:gs>
             <a:gs pos="100000">
               <a:schemeClr val="phClr">
-                <a:tint val="15000"/>
-                <a:satMod val="350000"/>
+                <a:lumMod val="105000"/>
+                <a:satMod val="109000"/>
+                <a:tint val="81000"/>
               </a:schemeClr>
             </a:gs>
           </a:gsLst>
-          <a:lin ang="16200000" scaled="1"/>
+          <a:lin ang="5400000" scaled="0"/>
         </a:gradFill>
         <a:gradFill rotWithShape="1">
           <a:gsLst>
             <a:gs pos="0">
               <a:schemeClr val="phClr">
-                <a:tint val="100000"/>
+                <a:satMod val="103000"/>
+                <a:lumMod val="102000"/>
+                <a:tint val="94000"/>
+              </a:schemeClr>
+            </a:gs>
+            <a:gs pos="50000">
+              <a:schemeClr val="phClr">
+                <a:satMod val="110000"/>
+                <a:lumMod val="100000"/>
                 <a:shade val="100000"/>
-                <a:satMod val="130000"/>
               </a:schemeClr>
             </a:gs>
             <a:gs pos="100000">
               <a:schemeClr val="phClr">
-                <a:tint val="50000"/>
-                <a:shade val="100000"/>
-                <a:satMod val="350000"/>
+                <a:lumMod val="99000"/>
+                <a:satMod val="120000"/>
+                <a:shade val="78000"/>
               </a:schemeClr>
             </a:gs>
           </a:gsLst>
-          <a:lin ang="16200000" scaled="0"/>
+          <a:lin ang="5400000" scaled="0"/>
         </a:gradFill>
       </a:fillStyleLst>
       <a:lnStyleLst>
-        <a:ln w="9525" cap="flat" cmpd="sng" algn="ctr">
-          <a:solidFill>
-            <a:schemeClr val="phClr">
-              <a:shade val="95000"/>
-              <a:satMod val="105000"/>
-            </a:schemeClr>
-          </a:solidFill>
-          <a:prstDash val="solid"/>
-        </a:ln>
-        <a:ln w="25400" cap="flat" cmpd="sng" algn="ctr">
+        <a:ln w="6350" cap="flat" cmpd="sng" algn="ctr">
           <a:solidFill>
             <a:schemeClr val="phClr"/>
           </a:solidFill>
           <a:prstDash val="solid"/>
+          <a:miter lim="800000"/>
         </a:ln>
-        <a:ln w="38100" cap="flat" cmpd="sng" algn="ctr">
+        <a:ln w="12700" cap="flat" cmpd="sng" algn="ctr">
           <a:solidFill>
             <a:schemeClr val="phClr"/>
           </a:solidFill>
           <a:prstDash val="solid"/>
+          <a:miter lim="800000"/>
+        </a:ln>
+        <a:ln w="19050" cap="flat" cmpd="sng" algn="ctr">
+          <a:solidFill>
+            <a:schemeClr val="phClr"/>
+          </a:solidFill>
+          <a:prstDash val="solid"/>
+          <a:miter lim="800000"/>
         </a:ln>
       </a:lnStyleLst>
       <a:effectStyleLst>
         <a:effectStyle>
+          <a:effectLst/>
+        </a:effectStyle>
+        <a:effectStyle>
+          <a:effectLst/>
+        </a:effectStyle>
+        <a:effectStyle>
           <a:effectLst>
-            <a:outerShdw blurRad="40000" dist="20000" dir="5400000" rotWithShape="0">
+            <a:outerShdw blurRad="57150" dist="19050" dir="5400000" algn="ctr" rotWithShape="0">
               <a:srgbClr val="000000">
-                <a:alpha val="38000"/>
+                <a:alpha val="63000"/>
               </a:srgbClr>
             </a:outerShdw>
           </a:effectLst>
-        </a:effectStyle>
-        <a:effectStyle>
-          <a:effectLst>
-            <a:outerShdw blurRad="40000" dist="23000" dir="5400000" rotWithShape="0">
-              <a:srgbClr val="000000">
-                <a:alpha val="35000"/>
-              </a:srgbClr>
-            </a:outerShdw>
-          </a:effectLst>
-        </a:effectStyle>
-        <a:effectStyle>
-          <a:effectLst>
-            <a:outerShdw blurRad="40000" dist="23000" dir="5400000" rotWithShape="0">
-              <a:srgbClr val="000000">
-                <a:alpha val="35000"/>
-              </a:srgbClr>
-            </a:outerShdw>
-          </a:effectLst>
-          <a:scene3d>
-            <a:camera prst="orthographicFront">
-              <a:rot lat="0" lon="0" rev="0"/>
-            </a:camera>
-            <a:lightRig rig="threePt" dir="t">
-              <a:rot lat="0" lon="0" rev="1200000"/>
-            </a:lightRig>
-          </a:scene3d>
-          <a:sp3d>
-            <a:bevelT w="63500" h="25400"/>
-          </a:sp3d>
         </a:effectStyle>
       </a:effectStyleLst>
       <a:bgFillStyleLst>
         <a:solidFill>
           <a:schemeClr val="phClr"/>
         </a:solidFill>
+        <a:solidFill>
+          <a:schemeClr val="phClr">
+            <a:tint val="95000"/>
+            <a:satMod val="170000"/>
+          </a:schemeClr>
+        </a:solidFill>
         <a:gradFill rotWithShape="1">
           <a:gsLst>
             <a:gs pos="0">
               <a:schemeClr val="phClr">
-                <a:tint val="40000"/>
-                <a:satMod val="350000"/>
+                <a:tint val="93000"/>
+                <a:satMod val="150000"/>
+                <a:shade val="98000"/>
+                <a:lumMod val="102000"/>
               </a:schemeClr>
             </a:gs>
-            <a:gs pos="40000">
+            <a:gs pos="50000">
               <a:schemeClr val="phClr">
-                <a:tint val="45000"/>
-                <a:shade val="99000"/>
-                <a:satMod val="350000"/>
+                <a:tint val="98000"/>
+                <a:satMod val="130000"/>
+                <a:shade val="90000"/>
+                <a:lumMod val="103000"/>
               </a:schemeClr>
             </a:gs>
             <a:gs pos="100000">
               <a:schemeClr val="phClr">
-                <a:shade val="20000"/>
-                <a:satMod val="255000"/>
+                <a:shade val="63000"/>
+                <a:satMod val="120000"/>
               </a:schemeClr>
             </a:gs>
           </a:gsLst>
-          <a:path path="circle">
-            <a:fillToRect l="50000" t="-80000" r="50000" b="180000"/>
-          </a:path>
-        </a:gradFill>
-        <a:gradFill rotWithShape="1">
-          <a:gsLst>
-            <a:gs pos="0">
-              <a:schemeClr val="phClr">
-                <a:tint val="80000"/>
-                <a:satMod val="300000"/>
-              </a:schemeClr>
-            </a:gs>
-            <a:gs pos="100000">
-              <a:schemeClr val="phClr">
-                <a:shade val="30000"/>
-                <a:satMod val="200000"/>
-              </a:schemeClr>
-            </a:gs>
-          </a:gsLst>
-          <a:path path="circle">
-            <a:fillToRect l="50000" t="50000" r="50000" b="50000"/>
-          </a:path>
+          <a:lin ang="5400000" scaled="0"/>
         </a:gradFill>
       </a:bgFillStyleLst>
     </a:fmtScheme>
   </a:themeElements>
-  <a:objectDefaults>
-    <a:spDef>
-      <a:spPr/>
-      <a:bodyPr/>
-      <a:lstStyle/>
-      <a:style>
-        <a:lnRef idx="1">
-          <a:schemeClr val="accent1"/>
-        </a:lnRef>
-        <a:fillRef idx="3">
-          <a:schemeClr val="accent1"/>
-        </a:fillRef>
-        <a:effectRef idx="2">
-          <a:schemeClr val="accent1"/>
-        </a:effectRef>
-        <a:fontRef idx="minor">
-          <a:schemeClr val="lt1"/>
-        </a:fontRef>
-      </a:style>
-    </a:spDef>
-    <a:lnDef>
-      <a:spPr/>
-      <a:bodyPr/>
-      <a:lstStyle/>
-      <a:style>
-        <a:lnRef idx="2">
-          <a:schemeClr val="accent1"/>
-        </a:lnRef>
-        <a:fillRef idx="0">
-          <a:schemeClr val="accent1"/>
-        </a:fillRef>
-        <a:effectRef idx="1">
-          <a:schemeClr val="accent1"/>
-        </a:effectRef>
-        <a:fontRef idx="minor">
-          <a:schemeClr val="tx1"/>
-        </a:fontRef>
-      </a:style>
-    </a:lnDef>
-  </a:objectDefaults>
+  <a:objectDefaults/>
   <a:extraClrSchemeLst/>
+  <a:extLst>
+    <a:ext uri="{05A4C25C-085E-4340-85A3-A5531E510DB2}">
+      <thm15:themeFamily xmlns:thm15="http://schemas.microsoft.com/office/thememl/2012/main" name="Office Theme" id="{2E142A2C-CD16-42D6-873A-C26D2A0506FA}" vid="{1BDDFF52-6CD6-40A5-AB3C-68EB2F1E4D0A}"/>
+    </a:ext>
+  </a:extLst>
 </a:theme>
 </file>
</xml_diff>